<commit_message>
Final submission polish: update app.py error handling, test_results.csv headers, README.md sections, and RAG_Project_Report.docx
</commit_message>
<xml_diff>
--- a/RAG_Project_Report.docx
+++ b/RAG_Project_Report.docx
@@ -28,7 +28,7 @@
           <w:color w:val="595959"/>
           <w:sz w:val="26"/>
         </w:rPr>
-        <w:t>A Fully Local Retrieval-Augmented Generation (RAG) System Using Open-Source Tools</w:t>
+        <w:t>A Local Retrieval-Augmented Generation (RAG) System Using Open-Source Tools</w:t>
         <w:br/>
         <w:t>AI/ML Capstone Project — TASK 03</w:t>
       </w:r>
@@ -54,7 +54,7 @@
     </w:p>
     <w:p>
       <w:r>
-        <w:t>In modern organizational environments, valuable information is stored across lengthy PDF documents, including policies, manuals, FAQs, and technical literature. Searching for precise answers within these documents manually is time-consuming and inefficient. Standard Large Language Models (LLMs) solve query tasks but suffer from hallucinations or lack access to domain-specific offline documents. Retrieval-Augmented Generation (RAG) bridges this gap by combining document vector retrieval with natural language generation, ensuring accurate, context-grounded answers.</w:t>
+        <w:t>In modern organizations, valuable knowledge is locked inside lengthy PDF files, including policy documents, FAQs, technical manuals, and textbooks. Locating specific information manually is inefficient. Standard Large Language Models (LLMs) provide natural language generation but lack access to private offline files and suffer from hallucinations. Retrieval-Augmented Generation (RAG) combines dense document retrieval with language model generation, delivering accurate, context-grounded answers accompanied by source page citations.</w:t>
       </w:r>
     </w:p>
     <w:p>
@@ -68,26 +68,26 @@
           <w:color w:val="1F4E79"/>
           <w:sz w:val="30"/>
         </w:rPr>
-        <w:t>2. Problem Statement &amp; Objectives</w:t>
+        <w:t>2. Problem Statement</w:t>
       </w:r>
     </w:p>
     <w:p>
       <w:r>
-        <w:t>The objective of this project is to build an end-to-end, 100% local Document Question-Answering Assistant. The application enables users to ask natural language questions against a repository of PDF documents and receive precise, grounded answers accompanied by exact source page citations.</w:t>
+        <w:t>Searching manually across hundreds of pages of PDF documents is tedious. Standard LLMs cannot access private offline documents and may invent facts. The goal of this project is to build a 100% local Document Question-Answering Assistant that accepts natural language questions, searches domain PDF documents, and generates answers strictly supported by retrieved text passages.</w:t>
       </w:r>
     </w:p>
     <w:p>
       <w:pPr>
-        <w:spacing w:before="200" w:after="60"/>
+        <w:spacing w:before="280" w:after="80"/>
       </w:pPr>
       <w:r>
         <w:rPr>
           <w:rFonts w:ascii="Calibri" w:hAnsi="Calibri"/>
           <w:b/>
-          <w:color w:val="2E75B6"/>
-          <w:sz w:val="24"/>
+          <w:color w:val="1F4E79"/>
+          <w:sz w:val="30"/>
         </w:rPr>
-        <w:t>Key Objectives:</w:t>
+        <w:t>3. Objectives</w:t>
       </w:r>
     </w:p>
     <w:p>
@@ -98,10 +98,10 @@
         <w:rPr>
           <w:b/>
         </w:rPr>
-        <w:t xml:space="preserve">Document Processing &amp; Chunking: </w:t>
+        <w:t xml:space="preserve">Document Extraction: </w:t>
       </w:r>
       <w:r>
-        <w:t>Extract text from diverse PDF documents and segment it into uniform, overlapping chunks.</w:t>
+        <w:t>Extract text and page metadata from PDF documents using PyPDF2.</w:t>
       </w:r>
     </w:p>
     <w:p>
@@ -112,10 +112,24 @@
         <w:rPr>
           <w:b/>
         </w:rPr>
-        <w:t xml:space="preserve">Vector Embedding &amp; Storage: </w:t>
+        <w:t xml:space="preserve">Chunking &amp; Embeddings: </w:t>
       </w:r>
       <w:r>
-        <w:t>Generate semantic embeddings using sentence-transformers and index them in a local FAISS vector database.</w:t>
+        <w:t>Split text into overlapping 700-character chunks and generate 384-dimensional embeddings using sentence-transformers.</w:t>
+      </w:r>
+    </w:p>
+    <w:p>
+      <w:pPr>
+        <w:pStyle w:val="ListBullet"/>
+      </w:pPr>
+      <w:r>
+        <w:rPr>
+          <w:b/>
+        </w:rPr>
+        <w:t xml:space="preserve">Vector Storage &amp; Retrieval: </w:t>
+      </w:r>
+      <w:r>
+        <w:t>Index normalized embeddings in a local FAISS vector store for fast cosine similarity search.</w:t>
       </w:r>
     </w:p>
     <w:p>
@@ -129,7 +143,7 @@
         <w:t xml:space="preserve">Local LLM Generation: </w:t>
       </w:r>
       <w:r>
-        <w:t>Retrieve top-k relevant passages and prompt a local Llama 3.2 model (via Ollama) to answer exclusively from the retrieved context.</w:t>
+        <w:t>Generate grounded answers using Llama 3.2 (3B) via Ollama, instructing the model to answer exclusively from context.</w:t>
       </w:r>
     </w:p>
     <w:p>
@@ -140,10 +154,10 @@
         <w:rPr>
           <w:b/>
         </w:rPr>
-        <w:t xml:space="preserve">User Interface: </w:t>
+        <w:t xml:space="preserve">Web UI &amp; Evaluation: </w:t>
       </w:r>
       <w:r>
-        <w:t>Deliver a clean, interactive Streamlit interface displaying answers and source page citations.</w:t>
+        <w:t>Provide a Streamlit web interface and evaluate performance on a 15-question test benchmark.</w:t>
       </w:r>
     </w:p>
     <w:p>
@@ -157,12 +171,12 @@
           <w:color w:val="1F4E79"/>
           <w:sz w:val="30"/>
         </w:rPr>
-        <w:t>3. Dataset &amp; Document Overview</w:t>
+        <w:t>4. Dataset &amp; Document Overview</w:t>
       </w:r>
     </w:p>
     <w:p>
       <w:r>
-        <w:t>The system indexes 6 open PDF documents spanning technology policies, machine learning concepts, AI fundamentals, and computer science textbooks:</w:t>
+        <w:t>The system indexes 6 open PDF documents spanning technology policies, AI principles, machine learning, and computer science:</w:t>
       </w:r>
     </w:p>
     <w:tbl>
@@ -199,7 +213,7 @@
               <w:rPr>
                 <w:b/>
               </w:rPr>
-              <w:t>Domain / Subject</w:t>
+              <w:t>Domain / Topic</w:t>
             </w:r>
           </w:p>
         </w:tc>
@@ -212,7 +226,7 @@
               <w:rPr>
                 <w:b/>
               </w:rPr>
-              <w:t>Description</w:t>
+              <w:t>Pages</w:t>
             </w:r>
           </w:p>
         </w:tc>
@@ -234,7 +248,7 @@
           </w:tcPr>
           <w:p>
             <w:r>
-              <w:t>Government IT Policy</w:t>
+              <w:t>Government IT Policy &amp; Open Source Policy</w:t>
             </w:r>
           </w:p>
         </w:tc>
@@ -244,7 +258,7 @@
           </w:tcPr>
           <w:p>
             <w:r>
-              <w:t>IT Rules 2021, Grievance Redressal, and Open Source Software Policy</w:t>
+              <w:t>212 pages</w:t>
             </w:r>
           </w:p>
         </w:tc>
@@ -266,7 +280,7 @@
           </w:tcPr>
           <w:p>
             <w:r>
-              <w:t>Grievance FAQs</w:t>
+              <w:t>IT Grievance Redressal FAQs</w:t>
             </w:r>
           </w:p>
         </w:tc>
@@ -276,7 +290,7 @@
           </w:tcPr>
           <w:p>
             <w:r>
-              <w:t>Frequently Asked Questions regarding IT Grievance procedures</w:t>
+              <w:t>19 pages</w:t>
             </w:r>
           </w:p>
         </w:tc>
@@ -298,7 +312,7 @@
           </w:tcPr>
           <w:p>
             <w:r>
-              <w:t>Generative AI</w:t>
+              <w:t>Generative AI Architectures &amp; LLMs</w:t>
             </w:r>
           </w:p>
         </w:tc>
@@ -308,7 +322,7 @@
           </w:tcPr>
           <w:p>
             <w:r>
-              <w:t>Overview of GenAI architectures, LLMs, and applications</w:t>
+              <w:t>37 pages</w:t>
             </w:r>
           </w:p>
         </w:tc>
@@ -330,7 +344,7 @@
           </w:tcPr>
           <w:p>
             <w:r>
-              <w:t>AI Fundamentals</w:t>
+              <w:t>Artificial Intelligence Fundamentals</w:t>
             </w:r>
           </w:p>
         </w:tc>
@@ -340,7 +354,7 @@
           </w:tcPr>
           <w:p>
             <w:r>
-              <w:t>Foundational principles of artificial intelligence and neural networks</w:t>
+              <w:t>72 pages</w:t>
             </w:r>
           </w:p>
         </w:tc>
@@ -362,7 +376,7 @@
           </w:tcPr>
           <w:p>
             <w:r>
-              <w:t>Machine Learning</w:t>
+              <w:t>Supervised &amp; Unsupervised Learning</w:t>
             </w:r>
           </w:p>
         </w:tc>
@@ -372,7 +386,7 @@
           </w:tcPr>
           <w:p>
             <w:r>
-              <w:t>Supervised, unsupervised, and reinforcement learning concepts</w:t>
+              <w:t>44 pages</w:t>
             </w:r>
           </w:p>
         </w:tc>
@@ -394,7 +408,7 @@
           </w:tcPr>
           <w:p>
             <w:r>
-              <w:t>Computer Science</w:t>
+              <w:t>NCERT Class 11 CS (Hardware &amp; Compilers)</w:t>
             </w:r>
           </w:p>
         </w:tc>
@@ -404,7 +418,7 @@
           </w:tcPr>
           <w:p>
             <w:r>
-              <w:t>NCERT Class 11 CS textbook chapter covering hardware and compilers</w:t>
+              <w:t>24 pages</w:t>
             </w:r>
           </w:p>
         </w:tc>
@@ -421,12 +435,12 @@
           <w:color w:val="1F4E79"/>
           <w:sz w:val="30"/>
         </w:rPr>
-        <w:t>4. Technology Stack</w:t>
+        <w:t>5. Technologies Used</w:t>
       </w:r>
     </w:p>
     <w:p>
       <w:r>
-        <w:t>The technology stack relies strictly on free, open-source tools running locally on a personal laptop without cloud dependencies or paid APIs:</w:t>
+        <w:t>All software tools used in this project are open-source and run locally on a personal laptop without cloud dependencies:</w:t>
       </w:r>
     </w:p>
     <w:p>
@@ -437,10 +451,10 @@
         <w:rPr>
           <w:b/>
         </w:rPr>
-        <w:t xml:space="preserve">Programming Language: </w:t>
+        <w:t xml:space="preserve">Python 3.13: </w:t>
       </w:r>
       <w:r>
-        <w:t>Python 3.13</w:t>
+        <w:t>Core runtime environment.</w:t>
       </w:r>
     </w:p>
     <w:p>
@@ -451,10 +465,10 @@
         <w:rPr>
           <w:b/>
         </w:rPr>
-        <w:t xml:space="preserve">PDF Extraction: </w:t>
+        <w:t xml:space="preserve">PyPDF2: </w:t>
       </w:r>
       <w:r>
-        <w:t>PyPDF2</w:t>
+        <w:t>PDF text extraction and page number tracking.</w:t>
       </w:r>
     </w:p>
     <w:p>
@@ -465,10 +479,10 @@
         <w:rPr>
           <w:b/>
         </w:rPr>
-        <w:t xml:space="preserve">Embedding Model: </w:t>
+        <w:t xml:space="preserve">sentence-transformers (all-MiniLM-L6-v2): </w:t>
       </w:r>
       <w:r>
-        <w:t>sentence-transformers (all-MiniLM-L6-v2, 384 dimensions)</w:t>
+        <w:t>Generating 384-dimensional dense semantic vector embeddings.</w:t>
       </w:r>
     </w:p>
     <w:p>
@@ -479,10 +493,10 @@
         <w:rPr>
           <w:b/>
         </w:rPr>
-        <w:t xml:space="preserve">Vector Store: </w:t>
+        <w:t xml:space="preserve">FAISS (IndexFlatIP): </w:t>
       </w:r>
       <w:r>
-        <w:t>FAISS (Facebook AI Similarity Search - IndexFlatIP)</w:t>
+        <w:t>Facebook AI Similarity Search for inner-product vector indexing.</w:t>
       </w:r>
     </w:p>
     <w:p>
@@ -493,10 +507,10 @@
         <w:rPr>
           <w:b/>
         </w:rPr>
-        <w:t xml:space="preserve">Local LLM Engine: </w:t>
+        <w:t xml:space="preserve">Ollama &amp; Llama 3.2 (3B): </w:t>
       </w:r>
       <w:r>
-        <w:t>Ollama running Llama 3.2 (3B parameters, quantized)</w:t>
+        <w:t>Local LLM inference server running quantized Llama 3.2.</w:t>
       </w:r>
     </w:p>
     <w:p>
@@ -507,10 +521,10 @@
         <w:rPr>
           <w:b/>
         </w:rPr>
-        <w:t xml:space="preserve">Web Application: </w:t>
+        <w:t xml:space="preserve">Streamlit: </w:t>
       </w:r>
       <w:r>
-        <w:t>Streamlit framework</w:t>
+        <w:t>Interactive web chat application interface.</w:t>
       </w:r>
     </w:p>
     <w:p>
@@ -524,17 +538,43 @@
           <w:color w:val="1F4E79"/>
           <w:sz w:val="30"/>
         </w:rPr>
-        <w:t>5. System Architecture &amp; Workflow</w:t>
+        <w:t>6. System Architecture &amp; Workflow Diagram</w:t>
       </w:r>
     </w:p>
     <w:p>
       <w:r>
-        <w:t>The RAG architecture operates in two main phases: Indexing (Offline) and Query Processing (Online).</w:t>
+        <w:t>The RAG workflow consists of an offline indexing pipeline and an online retrieval-generation pipeline:</w:t>
         <w:br/>
         <w:br/>
-        <w:t>1. Indexing Phase: PDFs → PyPDF2 Text Extraction → Character Chunking (700 chars, 150 overlap) → SentenceTransformer Embedding (384-d) → FAISS Index Creation &amp; Metadata Storage.</w:t>
+        <w:t>Documents (PDFs)</w:t>
         <w:br/>
-        <w:t>2. Query Phase: User Question → Question Embedding → FAISS Cosine Similarity Search (Top-5 Chunks) → Strict Grounded Prompt → Ollama Llama 3.2 Generation → Answer &amp; Source Citation UI.</w:t>
+        <w:t xml:space="preserve">    ↓</w:t>
+        <w:br/>
+        <w:t>Text Extraction (PyPDF2)</w:t>
+        <w:br/>
+        <w:t xml:space="preserve">    ↓</w:t>
+        <w:br/>
+        <w:t>Chunking (700 chars, 150 overlap)</w:t>
+        <w:br/>
+        <w:t xml:space="preserve">    ↓</w:t>
+        <w:br/>
+        <w:t>Embeddings (all-MiniLM-L6-v2)</w:t>
+        <w:br/>
+        <w:t xml:space="preserve">    ↓</w:t>
+        <w:br/>
+        <w:t>FAISS Indexing (vector_db/faiss.index)</w:t>
+        <w:br/>
+        <w:t xml:space="preserve">    ↓</w:t>
+        <w:br/>
+        <w:t>Retrieval (Top-5 Cosine Similarity)</w:t>
+        <w:br/>
+        <w:t xml:space="preserve">    ↓</w:t>
+        <w:br/>
+        <w:t>Llama 3.2 Generation (Ollama Local)</w:t>
+        <w:br/>
+        <w:t xml:space="preserve">    ↓</w:t>
+        <w:br/>
+        <w:t>Answer + Source Page Citations (Streamlit UI)</w:t>
       </w:r>
     </w:p>
     <w:p>
@@ -548,12 +588,12 @@
           <w:color w:val="1F4E79"/>
           <w:sz w:val="30"/>
         </w:rPr>
-        <w:t>6. Document Preprocessing &amp; Chunking Strategy</w:t>
+        <w:t>7. Document Preprocessing</w:t>
       </w:r>
     </w:p>
     <w:p>
       <w:r>
-        <w:t>Each PDF is parsed page by page using PyPDF2. Extracted text is sanitized to eliminate null bytes and normalized whitespace. A sliding window chunking technique is applied with chunk_size = 700 characters and overlap = 150 characters. This maintains contextual continuity across boundary sentences while ensuring chunks fit well within the transformer context limit. In total, 1,793 metadata-rich chunks were generated across the 6 documents, tracking source file name and page number.</w:t>
+        <w:t>PDF documents are parsed page by page using PyPDF2. Extracted text is sanitized to remove null bytes and extra whitespace. Each extracted text passage retains metadata mapping it directly to its source PDF file name and page number.</w:t>
       </w:r>
     </w:p>
     <w:p>
@@ -567,12 +607,12 @@
           <w:color w:val="1F4E79"/>
           <w:sz w:val="30"/>
         </w:rPr>
-        <w:t>7. Embedding Model &amp; Vector Database</w:t>
+        <w:t>8. Chunking Strategy</w:t>
       </w:r>
     </w:p>
     <w:p>
       <w:r>
-        <w:t>Text chunks are converted into dense vector representations using all-MiniLM-L6-v2. Embeddings are L2-normalized, yielding vectors of dimension 384. FAISS (IndexFlatIP) is configured for vector indexing. Because vectors are normalized, inner product computation is mathematically equivalent to cosine similarity, enabling efficient retrieval. The vector index is saved as vector_db/faiss.index alongside vector_db/metadata.json.</w:t>
+        <w:t>Text is segmented using a sliding window algorithm with a chunk size of 700 characters and an overlap of 150 characters. This configuration creates 1,793 chunks across all 6 documents. The 700-character length ensures complete sentence semantics for vector representation, while the 150-character overlap prevents information loss across chunk boundaries.</w:t>
       </w:r>
     </w:p>
     <w:p>
@@ -586,12 +626,12 @@
           <w:color w:val="1F4E79"/>
           <w:sz w:val="30"/>
         </w:rPr>
-        <w:t>8. Local Generation &amp; Grounding Prompt</w:t>
+        <w:t>9. Vector Embeddings</w:t>
       </w:r>
     </w:p>
     <w:p>
       <w:r>
-        <w:t>When a user submits a query, top-5 chunks are retrieved and formatted into a context block. The prompt explicitly instructs Llama 3.2 (3B via Ollama) to rely strictly on the provided context and respond with 'I could not find the answer in the provided documents' if the question is unsupported. This prevents LLM hallucination and ensures high factual grounding.</w:t>
+        <w:t>Each text chunk is converted into a 384-dimensional vector using the open-source sentence-transformers model 'all-MiniLM-L6-v2'. Vectors are L2-normalized so that inner product computations in FAISS match exact cosine similarity.</w:t>
       </w:r>
     </w:p>
     <w:p>
@@ -605,20 +645,12 @@
           <w:color w:val="1F4E79"/>
           <w:sz w:val="30"/>
         </w:rPr>
-        <w:t>9. Streamlit User Interface</w:t>
+        <w:t>10. FAISS Vector Database</w:t>
       </w:r>
     </w:p>
     <w:p>
       <w:r>
-        <w:t>The frontend application (app.py) provides a modern Streamlit interface featuring:</w:t>
-        <w:br/>
-        <w:t>• Interactive question input with clear/reset support.</w:t>
-        <w:br/>
-        <w:t>• A sidebar displaying project parameters, architecture, and loaded PDF files.</w:t>
-        <w:br/>
-        <w:t>• Expandable sample questions for testing.</w:t>
-        <w:br/>
-        <w:t>• Highlighted answer block and source citations detailing specific document names and page numbers.</w:t>
+        <w:t>The vector index is constructed using FAISS IndexFlatIP (Flat Inner Product). The index stores 1,793 vectors in vector_db/faiss.index (2.75 MB), while chunk text and page metadata are saved in vector_db/metadata.json (1.30 MB).</w:t>
       </w:r>
     </w:p>
     <w:p>
@@ -632,68 +664,12 @@
           <w:color w:val="1F4E79"/>
           <w:sz w:val="30"/>
         </w:rPr>
-        <w:t>10. Evaluation Methodology &amp; Test Results</w:t>
+        <w:t>11. Retrieval Process</w:t>
       </w:r>
     </w:p>
     <w:p>
       <w:r>
-        <w:t>A 15-question evaluation benchmark (test_set.csv) was created to test retrieval accuracy, answer correctness, and hallucination resistance. The test set includes questions from all 6 documents, including previously failing policy queries and an out-of-scope question.</w:t>
-      </w:r>
-    </w:p>
-    <w:p>
-      <w:pPr>
-        <w:spacing w:before="200" w:after="60"/>
-      </w:pPr>
-      <w:r>
-        <w:rPr>
-          <w:rFonts w:ascii="Calibri" w:hAnsi="Calibri"/>
-          <w:b/>
-          <w:color w:val="2E75B6"/>
-          <w:sz w:val="24"/>
-        </w:rPr>
-        <w:t>Evaluation Metrics Summary:</w:t>
-      </w:r>
-    </w:p>
-    <w:p>
-      <w:pPr>
-        <w:pStyle w:val="ListBullet"/>
-      </w:pPr>
-      <w:r>
-        <w:rPr>
-          <w:b/>
-        </w:rPr>
-        <w:t xml:space="preserve">Total Questions Tested: </w:t>
-      </w:r>
-      <w:r>
-        <w:t>15</w:t>
-      </w:r>
-    </w:p>
-    <w:p>
-      <w:pPr>
-        <w:pStyle w:val="ListBullet"/>
-      </w:pPr>
-      <w:r>
-        <w:rPr>
-          <w:b/>
-        </w:rPr>
-        <w:t xml:space="preserve">Passed (Fully Grounded &amp; Correct): </w:t>
-      </w:r>
-      <w:r>
-        <w:t>15 / 15 (100% Accuracy)</w:t>
-      </w:r>
-    </w:p>
-    <w:p>
-      <w:pPr>
-        <w:pStyle w:val="ListBullet"/>
-      </w:pPr>
-      <w:r>
-        <w:rPr>
-          <w:b/>
-        </w:rPr>
-        <w:t xml:space="preserve">Hallucinations / False Positives: </w:t>
-      </w:r>
-      <w:r>
-        <w:t>0 (Out-of-scope question was correctly rejected)</w:t>
+        <w:t>When a user submits a query, the question is embedded using all-MiniLM-L6-v2. FAISS performs cosine similarity search and retrieves the top-5 most relevant text chunks along with their source document names and page numbers.</w:t>
       </w:r>
     </w:p>
     <w:p>
@@ -707,16 +683,12 @@
           <w:color w:val="1F4E79"/>
           <w:sz w:val="30"/>
         </w:rPr>
-        <w:t>11. Limitations &amp; Future Enhancements</w:t>
+        <w:t>12. Llama 3.2 (3B) Local Generation</w:t>
       </w:r>
     </w:p>
     <w:p>
       <w:r>
-        <w:t>• PDF Tables &amp; Images: PyPDF2 extracts plain text; complex embedded tables or diagrams are not fully captured.</w:t>
-        <w:br/>
-        <w:t>• Hardware Dependence: Local inference speed depends on CPU/RAM resources.</w:t>
-        <w:br/>
-        <w:t>• Future Work: Integrate Hybrid Search (BM25 + Dense Retrieval) and multi-modal PDF parsing.</w:t>
+        <w:t>The top-5 retrieved chunks are formatted into a structured prompt context. Llama 3.2 3B receives the context with strict instructions to answer ONLY from the provided passages. If the answer cannot be found in the context, the model explicitly responds: 'I could not find the answer in the provided documents.'</w:t>
       </w:r>
     </w:p>
     <w:p>
@@ -730,12 +702,109 @@
           <w:color w:val="1F4E79"/>
           <w:sz w:val="30"/>
         </w:rPr>
-        <w:t>12. Conclusion</w:t>
+        <w:t>13. Ollama Server Integration</w:t>
       </w:r>
     </w:p>
     <w:p>
       <w:r>
-        <w:t>The Document Q&amp;A Assistant successfully implements a robust, open-source RAG pipeline that operates completely offline. By integrating PyPDF2, sentence-transformers, FAISS, and local Llama 3.2 via Ollama within a Streamlit UI, the system delivers precise, verifiable answers while preserving user privacy and eliminating API costs.</w:t>
+        <w:t>Ollama handles local LLM lifecycle and REST API requests. It allows quantized Llama 3.2 execution locally on CPU/GPU without cloud network calls or external data exposure.</w:t>
+      </w:r>
+    </w:p>
+    <w:p>
+      <w:pPr>
+        <w:spacing w:before="280" w:after="80"/>
+      </w:pPr>
+      <w:r>
+        <w:rPr>
+          <w:rFonts w:ascii="Calibri" w:hAnsi="Calibri"/>
+          <w:b/>
+          <w:color w:val="1F4E79"/>
+          <w:sz w:val="30"/>
+        </w:rPr>
+        <w:t>14. Streamlit Web Interface</w:t>
+      </w:r>
+    </w:p>
+    <w:p>
+      <w:r>
+        <w:t>The user application (app.py) features a clean Streamlit interface with a search bar, clear button, expandable sample queries helper, a sidebar listing loaded PDF documents, and structured rendering of generated answers alongside source page citations.</w:t>
+      </w:r>
+    </w:p>
+    <w:p>
+      <w:pPr>
+        <w:spacing w:before="280" w:after="80"/>
+      </w:pPr>
+      <w:r>
+        <w:rPr>
+          <w:rFonts w:ascii="Calibri" w:hAnsi="Calibri"/>
+          <w:b/>
+          <w:color w:val="1F4E79"/>
+          <w:sz w:val="30"/>
+        </w:rPr>
+        <w:t>15. Evaluation Methodology</w:t>
+      </w:r>
+    </w:p>
+    <w:p>
+      <w:r>
+        <w:t>A 15-question evaluation benchmark (test_set.csv) was created to test retrieval accuracy, answer correctness, and grounding. The test set includes questions from all 6 documents, policy timelines, IT rules, machine learning concepts, and an out-of-scope question to test hallucination resistance.</w:t>
+      </w:r>
+    </w:p>
+    <w:p>
+      <w:pPr>
+        <w:spacing w:before="280" w:after="80"/>
+      </w:pPr>
+      <w:r>
+        <w:rPr>
+          <w:rFonts w:ascii="Calibri" w:hAnsi="Calibri"/>
+          <w:b/>
+          <w:color w:val="1F4E79"/>
+          <w:sz w:val="30"/>
+        </w:rPr>
+        <w:t>16. Test Results &amp; Discussion</w:t>
+      </w:r>
+    </w:p>
+    <w:p>
+      <w:r>
+        <w:t>All 15 benchmark questions returned grounded, correct answers matching retrieved document passages. The out-of-scope question was correctly rejected with the message 'I could not find the answer in the provided documents.' Full test outputs are recorded in test_results.csv.</w:t>
+      </w:r>
+    </w:p>
+    <w:p>
+      <w:pPr>
+        <w:spacing w:before="280" w:after="80"/>
+      </w:pPr>
+      <w:r>
+        <w:rPr>
+          <w:rFonts w:ascii="Calibri" w:hAnsi="Calibri"/>
+          <w:b/>
+          <w:color w:val="1F4E79"/>
+          <w:sz w:val="30"/>
+        </w:rPr>
+        <w:t>17. System Limitations</w:t>
+      </w:r>
+    </w:p>
+    <w:p>
+      <w:r>
+        <w:t>• PDF Table Parsing: PyPDF2 extracts plain text; complex embedded tables or image diagrams in PDFs are not converted into structured data tables.</w:t>
+        <w:br/>
+        <w:t>• System Hardware Speed: Response generation latency depends on local laptop CPU and RAM capabilities.</w:t>
+      </w:r>
+    </w:p>
+    <w:p>
+      <w:pPr>
+        <w:spacing w:before="280" w:after="80"/>
+      </w:pPr>
+      <w:r>
+        <w:rPr>
+          <w:rFonts w:ascii="Calibri" w:hAnsi="Calibri"/>
+          <w:b/>
+          <w:color w:val="1F4E79"/>
+          <w:sz w:val="30"/>
+        </w:rPr>
+        <w:t>18. Conclusion</w:t>
+      </w:r>
+    </w:p>
+    <w:p>
+      <w:r>
+        <w:t>The Document Q&amp;A Assistant demonstrates a fully functional, open-source RAG system operating completely offline. By integrating PyPDF2, sentence-transformers, FAISS, Ollama Llama 3.2, and Streamlit, the application delivers accurate, verifiable answer generation with zero API costs.</w:t>
       </w:r>
     </w:p>
     <w:sectPr>

</xml_diff>

<commit_message>
Update document names to IT_Rules FQA and NCERT Societal Impact, rebuild index, and add result screenshot to README
</commit_message>
<xml_diff>
--- a/RAG_Project_Report.docx
+++ b/RAG_Project_Report.docx
@@ -270,7 +270,7 @@
           </w:tcPr>
           <w:p>
             <w:r>
-              <w:t>fqa.pdf</w:t>
+              <w:t>IT_Rules FQA.pdf</w:t>
             </w:r>
           </w:p>
         </w:tc>
@@ -398,7 +398,7 @@
           </w:tcPr>
           <w:p>
             <w:r>
-              <w:t>kecs111.pdf</w:t>
+              <w:t>NCERT Societal Impact.pdf</w:t>
             </w:r>
           </w:p>
         </w:tc>

</xml_diff>